<commit_message>
Sync confirmed two-page resume attachments pending new-site URL
</commit_message>
<xml_diff>
--- a/public/portfolio/li-benyan-resume.docx
+++ b/public/portfolio/li-benyan-resume.docx
@@ -28,7 +28,7 @@
           <w:p>
             <w:pPr>
               <w:pStyle w:val="Title"/>
-              <w:spacing w:after="60"/>
+              <w:spacing w:after="60" w:line="600" w:lineRule="exact"/>
             </w:pPr>
             <w:r>
               <w:rPr>
@@ -51,7 +51,7 @@
                 <w:color w:val="24586B"/>
                 <w:sz w:val="23"/>
               </w:rPr>
-              <w:t>游戏开发程序员  /  独立游戏开发</w:t>
+              <w:t>游戏开发  /  AI 产品开发</w:t>
             </w:r>
           </w:p>
           <w:p>
@@ -130,6 +130,7 @@
           </w:tcPr>
           <w:p>
             <w:pPr>
+              <w:spacing w:line="240" w:lineRule="auto" w:after="0"/>
               <w:jc w:val="right"/>
             </w:pPr>
             <w:r>
@@ -174,7 +175,134 @@
       <w:pPr>
         <w:pStyle w:val="Heading1"/>
         <w:keepNext/>
-        <w:spacing w:after="100" w:before="160"/>
+        <w:spacing w:after="100" w:before="160" w:line="300" w:lineRule="exact"/>
+        <w:pBdr>
+          <w:bottom w:val="single" w:sz="4" w:space="3" w:color="ABB6BA"/>
+        </w:pBdr>
+      </w:pPr>
+      <w:r>
+        <w:rPr>
+          <w:rFonts w:ascii="Arial" w:hAnsi="Arial" w:eastAsia="Microsoft YaHei"/>
+          <w:b/>
+          <w:color w:val="24586B"/>
+          <w:sz w:val="24"/>
+        </w:rPr>
+        <w:t>自我评价</w:t>
+      </w:r>
+    </w:p>
+    <w:p>
+      <w:pPr>
+        <w:keepNext w:val="0"/>
+        <w:widowControl/>
+        <w:spacing w:after="60" w:before="0" w:line="284" w:lineRule="exact"/>
+        <w:ind w:left="142" w:hanging="142"/>
+      </w:pPr>
+      <w:r>
+        <w:rPr>
+          <w:rFonts w:ascii="Arial" w:hAnsi="Arial" w:eastAsia="Microsoft YaHei"/>
+          <w:b/>
+          <w:color w:val="24586B"/>
+          <w:sz w:val="20"/>
+        </w:rPr>
+        <w:t xml:space="preserve">• </w:t>
+      </w:r>
+      <w:r>
+        <w:rPr>
+          <w:rFonts w:ascii="Arial" w:hAnsi="Arial" w:eastAsia="Microsoft YaHei"/>
+          <w:b/>
+          <w:color w:val="19252E"/>
+          <w:sz w:val="20"/>
+        </w:rPr>
+        <w:t>项目经验：</w:t>
+      </w:r>
+      <w:r>
+        <w:rPr>
+          <w:rFonts w:ascii="Arial" w:hAnsi="Arial" w:eastAsia="Microsoft YaHei"/>
+          <w:b w:val="0"/>
+          <w:color w:val="19252E"/>
+          <w:sz w:val="20"/>
+        </w:rPr>
+        <w:t>有 AI 产品开发实习与商业游戏定制经历，参与四川农业大学 120 年校庆校园历史游戏，具备从需求拆解到可运行原型的实践经验。</w:t>
+      </w:r>
+    </w:p>
+    <w:p>
+      <w:pPr>
+        <w:keepNext w:val="0"/>
+        <w:widowControl/>
+        <w:spacing w:after="60" w:before="0" w:line="284" w:lineRule="exact"/>
+        <w:ind w:left="142" w:hanging="142"/>
+      </w:pPr>
+      <w:r>
+        <w:rPr>
+          <w:rFonts w:ascii="Arial" w:hAnsi="Arial" w:eastAsia="Microsoft YaHei"/>
+          <w:b/>
+          <w:color w:val="24586B"/>
+          <w:sz w:val="20"/>
+        </w:rPr>
+        <w:t xml:space="preserve">• </w:t>
+      </w:r>
+      <w:r>
+        <w:rPr>
+          <w:rFonts w:ascii="Arial" w:hAnsi="Arial" w:eastAsia="Microsoft YaHei"/>
+          <w:b/>
+          <w:color w:val="19252E"/>
+          <w:sz w:val="20"/>
+        </w:rPr>
+        <w:t>技术实现：</w:t>
+      </w:r>
+      <w:r>
+        <w:rPr>
+          <w:rFonts w:ascii="Arial" w:hAnsi="Arial" w:eastAsia="Microsoft YaHei"/>
+          <w:b w:val="0"/>
+          <w:color w:val="19252E"/>
+          <w:sz w:val="20"/>
+        </w:rPr>
+        <w:t>使用 Unity / C# 开发玩法与交互系统，并有 Three.js 浏览器 3D 项目经验，能够整合 UI、美术、动画与音频，推进构建和演示。</w:t>
+      </w:r>
+    </w:p>
+    <w:p>
+      <w:pPr>
+        <w:keepNext w:val="0"/>
+        <w:widowControl/>
+        <w:spacing w:after="60" w:before="0" w:line="284" w:lineRule="exact"/>
+        <w:ind w:left="142" w:hanging="142"/>
+      </w:pPr>
+      <w:r>
+        <w:rPr>
+          <w:rFonts w:ascii="Arial" w:hAnsi="Arial" w:eastAsia="Microsoft YaHei"/>
+          <w:b/>
+          <w:color w:val="24586B"/>
+          <w:sz w:val="20"/>
+        </w:rPr>
+        <w:t xml:space="preserve">• </w:t>
+      </w:r>
+      <w:r>
+        <w:rPr>
+          <w:rFonts w:ascii="Arial" w:hAnsi="Arial" w:eastAsia="Microsoft YaHei"/>
+          <w:b/>
+          <w:color w:val="19252E"/>
+          <w:sz w:val="20"/>
+        </w:rPr>
+        <w:t>主动探索与问题解决：</w:t>
+      </w:r>
+      <w:r>
+        <w:rPr>
+          <w:rFonts w:ascii="Arial" w:hAnsi="Arial" w:eastAsia="Microsoft YaHei"/>
+          <w:b w:val="0"/>
+          <w:color w:val="19252E"/>
+          <w:sz w:val="20"/>
+        </w:rPr>
+        <w:t>围绕作品持续调研和试验，自主探索音效生成方法，并主动与同类游戏开发者交流，找到动画与游戏特效难题的可行方案，通过反复验证推进实现。</w:t>
+      </w:r>
+    </w:p>
+    <w:p>
+      <w:pPr>
+        <w:pStyle w:val="Heading1"/>
+        <w:keepNext/>
+        <w:spacing w:after="100" w:before="160" w:line="300" w:lineRule="exact"/>
+        <w:pBdr>
+          <w:bottom w:val="single" w:sz="4" w:space="3" w:color="ABB6BA"/>
+        </w:pBdr>
       </w:pPr>
       <w:r>
         <w:rPr>
@@ -188,9 +316,22 @@
     </w:p>
     <w:p>
       <w:pPr>
-        <w:keepNext w:val="0"/>
-        <w:spacing w:after="40" w:before="0"/>
+        <w:keepNext/>
+        <w:tabs>
+          <w:tab w:pos="2721" w:val="left"/>
+          <w:tab w:pos="10035" w:val="right"/>
+        </w:tabs>
+        <w:spacing w:after="60" w:before="100" w:line="284" w:lineRule="exact"/>
       </w:pPr>
+      <w:r>
+        <w:rPr>
+          <w:rFonts w:ascii="Arial" w:hAnsi="Arial" w:eastAsia="Microsoft YaHei"/>
+          <w:b/>
+          <w:color w:val="53616B"/>
+          <w:sz w:val="18"/>
+        </w:rPr>
+        <w:t>2024.09-至今</w:t>
+      </w:r>
       <w:r>
         <w:rPr>
           <w:rFonts w:ascii="Arial" w:hAnsi="Arial" w:eastAsia="Microsoft YaHei"/>
@@ -198,22 +339,24 @@
           <w:color w:val="19252E"/>
           <w:sz w:val="21"/>
         </w:rPr>
+        <w:tab/>
         <w:t>成都东软学院</w:t>
       </w:r>
       <w:r>
         <w:rPr>
           <w:rFonts w:ascii="Arial" w:hAnsi="Arial" w:eastAsia="Microsoft YaHei"/>
-          <w:b w:val="0"/>
+          <w:b/>
           <w:color w:val="53616B"/>
-          <w:sz w:val="20"/>
+          <w:sz w:val="18"/>
         </w:rPr>
-        <w:t xml:space="preserve">  数字媒体技术 · 本科在读  |  2024.09-至今</w:t>
+        <w:tab/>
+        <w:t>本科 · 数字媒体技术</w:t>
       </w:r>
     </w:p>
     <w:p>
       <w:pPr>
         <w:keepNext w:val="0"/>
-        <w:spacing w:after="60" w:before="0"/>
+        <w:spacing w:after="60" w:before="0" w:line="284" w:lineRule="exact"/>
       </w:pPr>
       <w:r>
         <w:rPr>
@@ -229,7 +372,10 @@
       <w:pPr>
         <w:pStyle w:val="Heading1"/>
         <w:keepNext/>
-        <w:spacing w:after="100" w:before="160"/>
+        <w:spacing w:after="100" w:before="160" w:line="300" w:lineRule="exact"/>
+        <w:pBdr>
+          <w:bottom w:val="single" w:sz="4" w:space="3" w:color="ABB6BA"/>
+        </w:pBdr>
       </w:pPr>
       <w:r>
         <w:rPr>
@@ -238,14 +384,73 @@
           <w:color w:val="24586B"/>
           <w:sz w:val="24"/>
         </w:rPr>
-        <w:t>个人优势与技能</w:t>
+        <w:t>实习经历</w:t>
+      </w:r>
+    </w:p>
+    <w:p>
+      <w:pPr>
+        <w:keepNext/>
+        <w:tabs>
+          <w:tab w:pos="2721" w:val="left"/>
+          <w:tab w:pos="10035" w:val="right"/>
+        </w:tabs>
+        <w:spacing w:after="60" w:before="100" w:line="284" w:lineRule="exact"/>
+      </w:pPr>
+      <w:r>
+        <w:rPr>
+          <w:rFonts w:ascii="Arial" w:hAnsi="Arial" w:eastAsia="Microsoft YaHei"/>
+          <w:b/>
+          <w:color w:val="53616B"/>
+          <w:sz w:val="18"/>
+        </w:rPr>
+        <w:t>2026 年暑期（2个月）</w:t>
+      </w:r>
+      <w:r>
+        <w:rPr>
+          <w:rFonts w:ascii="Arial" w:hAnsi="Arial" w:eastAsia="Microsoft YaHei"/>
+          <w:b/>
+          <w:color w:val="19252E"/>
+          <w:sz w:val="21"/>
+        </w:rPr>
+        <w:tab/>
+        <w:t>猪佳科技</w:t>
+      </w:r>
+      <w:r>
+        <w:rPr>
+          <w:rFonts w:ascii="Arial" w:hAnsi="Arial" w:eastAsia="Microsoft YaHei"/>
+          <w:b/>
+          <w:color w:val="53616B"/>
+          <w:sz w:val="18"/>
+        </w:rPr>
+        <w:tab/>
+        <w:t>AI 产品开发实习生</w:t>
       </w:r>
     </w:p>
     <w:p>
       <w:pPr>
         <w:keepNext w:val="0"/>
-        <w:spacing w:after="60" w:before="0"/>
+        <w:widowControl/>
+        <w:spacing w:after="60" w:before="0" w:line="284" w:lineRule="exact"/>
+        <w:ind w:left="142" w:hanging="142"/>
       </w:pPr>
+      <w:r>
+        <w:rPr>
+          <w:rFonts w:ascii="Arial" w:hAnsi="Arial" w:eastAsia="Microsoft YaHei"/>
+          <w:b/>
+          <w:color w:val="24586B"/>
+          <w:sz w:val="20"/>
+        </w:rPr>
+        <w:t xml:space="preserve">• </w:t>
+      </w:r>
+      <w:r>
+        <w:rPr>
+          <w:rFonts w:ascii="Arial" w:hAnsi="Arial" w:eastAsia="Microsoft YaHei"/>
+          <w:b/>
+          <w:color w:val="19252E"/>
+          <w:sz w:val="20"/>
+        </w:rPr>
+        <w:t>需求与原型：</w:t>
+      </w:r>
       <w:r>
         <w:rPr>
           <w:rFonts w:ascii="Arial" w:hAnsi="Arial" w:eastAsia="Microsoft YaHei"/>
@@ -253,29 +458,52 @@
           <w:color w:val="19252E"/>
           <w:sz w:val="20"/>
         </w:rPr>
-        <w:t>具备 Unity 2D 游戏、移动端商业定制与浏览器 3D 交互项目经验，可统筹玩法、UI、美术与声音整合、程序及构建发布；使用 AI 辅助开发，并通过实机检查和迭代推进项目。</w:t>
+        <w:t>参与四川农业大学 120 年校庆校园历史游戏，围绕校史资料梳理场景、任务和交互需求，推进玩法原型制作。</w:t>
       </w:r>
     </w:p>
     <w:p>
       <w:pPr>
         <w:keepNext w:val="0"/>
-        <w:spacing w:after="40" w:before="0"/>
+        <w:widowControl/>
+        <w:spacing w:after="60" w:before="0" w:line="284" w:lineRule="exact"/>
+        <w:ind w:left="142" w:hanging="142"/>
       </w:pPr>
+      <w:r>
+        <w:rPr>
+          <w:rFonts w:ascii="Arial" w:hAnsi="Arial" w:eastAsia="Microsoft YaHei"/>
+          <w:b/>
+          <w:color w:val="24586B"/>
+          <w:sz w:val="20"/>
+        </w:rPr>
+        <w:t xml:space="preserve">• </w:t>
+      </w:r>
+      <w:r>
+        <w:rPr>
+          <w:rFonts w:ascii="Arial" w:hAnsi="Arial" w:eastAsia="Microsoft YaHei"/>
+          <w:b/>
+          <w:color w:val="19252E"/>
+          <w:sz w:val="20"/>
+        </w:rPr>
+        <w:t>开发与迭代：</w:t>
+      </w:r>
       <w:r>
         <w:rPr>
           <w:rFonts w:ascii="Arial" w:hAnsi="Arial" w:eastAsia="Microsoft YaHei"/>
           <w:b w:val="0"/>
           <w:color w:val="19252E"/>
-          <w:sz w:val="19"/>
+          <w:sz w:val="20"/>
         </w:rPr>
-        <w:t>主要技术：Unity 6 / C#、Three.js / JavaScript / WebGL、Git；Blender 与 UE5 场景制作实践。</w:t>
+        <w:t>使用 AI 辅助 Unity 功能开发、界面和素材整合，通过试玩与录屏梳理问题、迭代功能，并整理阶段演示与汇报内容。</w:t>
       </w:r>
     </w:p>
     <w:p>
       <w:pPr>
         <w:pStyle w:val="Heading1"/>
         <w:keepNext/>
-        <w:spacing w:after="100" w:before="160"/>
+        <w:spacing w:after="100" w:before="160" w:line="300" w:lineRule="exact"/>
+        <w:pBdr>
+          <w:bottom w:val="single" w:sz="4" w:space="3" w:color="ABB6BA"/>
+        </w:pBdr>
       </w:pPr>
       <w:r>
         <w:rPr>
@@ -284,7 +512,7 @@
           <w:color w:val="24586B"/>
           <w:sz w:val="24"/>
         </w:rPr>
-        <w:t>重点项目经历</w:t>
+        <w:t>项目经历</w:t>
       </w:r>
     </w:p>
     <w:p>
@@ -293,7 +521,7 @@
         <w:tabs>
           <w:tab w:pos="10035" w:val="right"/>
         </w:tabs>
-        <w:spacing w:after="40" w:before="120"/>
+        <w:spacing w:after="40" w:before="80" w:line="284" w:lineRule="exact"/>
       </w:pPr>
       <w:r>
         <w:rPr>
@@ -312,13 +540,13 @@
           <w:sz w:val="18"/>
         </w:rPr>
         <w:tab/>
-        <w:t>2026.09-至今</w:t>
+        <w:t>2026.09-2026.10</w:t>
       </w:r>
     </w:p>
     <w:p>
       <w:pPr>
         <w:keepNext/>
-        <w:spacing w:after="80" w:before="0"/>
+        <w:spacing w:after="40" w:before="0" w:line="284" w:lineRule="exact"/>
       </w:pPr>
       <w:r>
         <w:rPr>
@@ -334,7 +562,7 @@
       <w:pPr>
         <w:keepNext w:val="0"/>
         <w:widowControl/>
-        <w:spacing w:after="60" w:before="0"/>
+        <w:spacing w:after="60" w:before="0" w:line="284" w:lineRule="exact"/>
         <w:ind w:left="142" w:hanging="142"/>
       </w:pPr>
       <w:r>
@@ -360,7 +588,7 @@
       <w:pPr>
         <w:keepNext w:val="0"/>
         <w:widowControl/>
-        <w:spacing w:after="60" w:before="0"/>
+        <w:spacing w:after="60" w:before="0" w:line="284" w:lineRule="exact"/>
         <w:ind w:left="142" w:hanging="142"/>
       </w:pPr>
       <w:r>
@@ -386,7 +614,7 @@
       <w:pPr>
         <w:keepNext w:val="0"/>
         <w:widowControl/>
-        <w:spacing w:after="60" w:before="0"/>
+        <w:spacing w:after="60" w:before="0" w:line="284" w:lineRule="exact"/>
         <w:ind w:left="142" w:hanging="142"/>
       </w:pPr>
       <w:r>
@@ -414,7 +642,7 @@
         <w:tabs>
           <w:tab w:pos="10035" w:val="right"/>
         </w:tabs>
-        <w:spacing w:after="40" w:before="120"/>
+        <w:spacing w:after="40" w:before="80" w:line="284" w:lineRule="exact"/>
       </w:pPr>
       <w:r>
         <w:rPr>
@@ -423,7 +651,7 @@
           <w:color w:val="19252E"/>
           <w:sz w:val="22"/>
         </w:rPr>
-        <w:t>百廿列车  校史叙事与互动探索</w:t>
+        <w:t>百廿列车  校园历史游戏</w:t>
       </w:r>
       <w:r>
         <w:rPr>
@@ -433,13 +661,13 @@
           <w:sz w:val="18"/>
         </w:rPr>
         <w:tab/>
-        <w:t>2026.08-至今</w:t>
+        <w:t>2026.07-2026.08</w:t>
       </w:r>
     </w:p>
     <w:p>
       <w:pPr>
         <w:keepNext/>
-        <w:spacing w:after="80" w:before="0"/>
+        <w:spacing w:after="40" w:before="0" w:line="284" w:lineRule="exact"/>
       </w:pPr>
       <w:r>
         <w:rPr>
@@ -448,14 +676,14 @@
           <w:color w:val="53616B"/>
           <w:sz w:val="19"/>
         </w:rPr>
-        <w:t>委托开发 · 章节式叙事游戏  |  游戏设计与程序实现  |  Unity / C#</w:t>
+        <w:t>四川农业大学 120 年校庆项目  |  游戏设计与程序实现  |  Unity / C#</w:t>
       </w:r>
     </w:p>
     <w:p>
       <w:pPr>
         <w:keepNext w:val="0"/>
         <w:widowControl/>
-        <w:spacing w:after="60" w:before="0"/>
+        <w:spacing w:after="60" w:before="0" w:line="284" w:lineRule="exact"/>
         <w:ind w:left="142" w:hanging="142"/>
       </w:pPr>
       <w:r>
@@ -470,18 +698,27 @@
       <w:r>
         <w:rPr>
           <w:rFonts w:ascii="Arial" w:hAnsi="Arial" w:eastAsia="Microsoft YaHei"/>
+          <w:b/>
+          <w:color w:val="19252E"/>
+          <w:sz w:val="20"/>
+        </w:rPr>
+        <w:t>项目背景：</w:t>
+      </w:r>
+      <w:r>
+        <w:rPr>
+          <w:rFonts w:ascii="Arial" w:hAnsi="Arial" w:eastAsia="Microsoft YaHei"/>
           <w:b w:val="0"/>
           <w:color w:val="19252E"/>
           <w:sz w:val="20"/>
         </w:rPr>
-        <w:t>将校史资料组织为展厅、历史场景与列车章节，结合探索、角色对话、档案收集及小游戏推进叙事。</w:t>
+        <w:t>为四川农业大学 120 年校庆制作校园历史游戏，将校史资料转化为展厅探索、历史场景和列车章节，面向师生、校友与校庆参观者。</w:t>
       </w:r>
     </w:p>
     <w:p>
       <w:pPr>
         <w:keepNext w:val="0"/>
         <w:widowControl/>
-        <w:spacing w:after="60" w:before="0"/>
+        <w:spacing w:after="60" w:before="0" w:line="284" w:lineRule="exact"/>
         <w:ind w:left="142" w:hanging="142"/>
       </w:pPr>
       <w:r>
@@ -507,7 +744,7 @@
       <w:pPr>
         <w:keepNext w:val="0"/>
         <w:widowControl/>
-        <w:spacing w:after="60" w:before="0"/>
+        <w:spacing w:after="60" w:before="0" w:line="284" w:lineRule="exact"/>
         <w:ind w:left="142" w:hanging="142"/>
       </w:pPr>
       <w:r>
@@ -535,7 +772,7 @@
         <w:tabs>
           <w:tab w:pos="10035" w:val="right"/>
         </w:tabs>
-        <w:spacing w:after="40" w:before="120"/>
+        <w:spacing w:after="40" w:before="80" w:line="284" w:lineRule="exact"/>
       </w:pPr>
       <w:r>
         <w:rPr>
@@ -560,7 +797,7 @@
     <w:p>
       <w:pPr>
         <w:keepNext/>
-        <w:spacing w:after="80" w:before="0"/>
+        <w:spacing w:after="40" w:before="0" w:line="284" w:lineRule="exact"/>
       </w:pPr>
       <w:r>
         <w:rPr>
@@ -576,7 +813,7 @@
       <w:pPr>
         <w:keepNext w:val="0"/>
         <w:widowControl/>
-        <w:spacing w:after="60" w:before="0"/>
+        <w:spacing w:after="60" w:before="0" w:line="284" w:lineRule="exact"/>
         <w:ind w:left="142" w:hanging="142"/>
       </w:pPr>
       <w:r>
@@ -602,7 +839,7 @@
       <w:pPr>
         <w:keepNext w:val="0"/>
         <w:widowControl/>
-        <w:spacing w:after="60" w:before="0"/>
+        <w:spacing w:after="60" w:before="0" w:line="284" w:lineRule="exact"/>
         <w:ind w:left="142" w:hanging="142"/>
       </w:pPr>
       <w:r>
@@ -628,7 +865,7 @@
       <w:pPr>
         <w:keepNext w:val="0"/>
         <w:widowControl/>
-        <w:spacing w:after="60" w:before="0"/>
+        <w:spacing w:after="60" w:before="0" w:line="284" w:lineRule="exact"/>
         <w:ind w:left="142" w:hanging="142"/>
       </w:pPr>
       <w:r>
@@ -658,7 +895,7 @@
     <w:p>
       <w:pPr>
         <w:keepNext w:val="0"/>
-        <w:spacing w:after="200" w:before="0"/>
+        <w:spacing w:after="200" w:before="0" w:line="350" w:lineRule="exact"/>
       </w:pPr>
       <w:r>
         <w:rPr>
@@ -667,7 +904,7 @@
           <w:color w:val="19252E"/>
           <w:sz w:val="28"/>
         </w:rPr>
-        <w:t>李本研  /  游戏开发项目经历</w:t>
+        <w:t>李本研  /  项目经历与专业技能</w:t>
       </w:r>
     </w:p>
     <w:p>
@@ -676,7 +913,7 @@
         <w:tabs>
           <w:tab w:pos="10035" w:val="right"/>
         </w:tabs>
-        <w:spacing w:after="40" w:before="120"/>
+        <w:spacing w:after="40" w:before="80" w:line="284" w:lineRule="exact"/>
       </w:pPr>
       <w:r>
         <w:rPr>
@@ -701,7 +938,7 @@
     <w:p>
       <w:pPr>
         <w:keepNext/>
-        <w:spacing w:after="80" w:before="0"/>
+        <w:spacing w:after="40" w:before="0" w:line="284" w:lineRule="exact"/>
       </w:pPr>
       <w:r>
         <w:rPr>
@@ -717,7 +954,7 @@
       <w:pPr>
         <w:keepNext w:val="0"/>
         <w:widowControl/>
-        <w:spacing w:after="60" w:before="0"/>
+        <w:spacing w:after="60" w:before="0" w:line="284" w:lineRule="exact"/>
         <w:ind w:left="142" w:hanging="142"/>
       </w:pPr>
       <w:r>
@@ -743,7 +980,7 @@
       <w:pPr>
         <w:keepNext w:val="0"/>
         <w:widowControl/>
-        <w:spacing w:after="60" w:before="0"/>
+        <w:spacing w:after="60" w:before="0" w:line="284" w:lineRule="exact"/>
         <w:ind w:left="142" w:hanging="142"/>
       </w:pPr>
       <w:r>
@@ -769,7 +1006,7 @@
       <w:pPr>
         <w:keepNext w:val="0"/>
         <w:widowControl/>
-        <w:spacing w:after="60" w:before="0"/>
+        <w:spacing w:after="60" w:before="0" w:line="284" w:lineRule="exact"/>
         <w:ind w:left="142" w:hanging="142"/>
       </w:pPr>
       <w:r>
@@ -795,7 +1032,10 @@
       <w:pPr>
         <w:pStyle w:val="Heading1"/>
         <w:keepNext/>
-        <w:spacing w:after="100" w:before="160"/>
+        <w:spacing w:after="100" w:before="160" w:line="300" w:lineRule="exact"/>
+        <w:pBdr>
+          <w:bottom w:val="single" w:sz="4" w:space="3" w:color="ABB6BA"/>
+        </w:pBdr>
       </w:pPr>
       <w:r>
         <w:rPr>
@@ -813,7 +1053,7 @@
         <w:tabs>
           <w:tab w:pos="10035" w:val="right"/>
         </w:tabs>
-        <w:spacing w:after="40" w:before="120"/>
+        <w:spacing w:after="40" w:before="80" w:line="284" w:lineRule="exact"/>
       </w:pPr>
       <w:r>
         <w:rPr>
@@ -832,13 +1072,13 @@
           <w:sz w:val="18"/>
         </w:rPr>
         <w:tab/>
-        <w:t>已完成</w:t>
+        <w:t>2026.05-2026.06</w:t>
       </w:r>
     </w:p>
     <w:p>
       <w:pPr>
         <w:keepNext/>
-        <w:spacing w:after="80" w:before="0"/>
+        <w:spacing w:after="40" w:before="0" w:line="284" w:lineRule="exact"/>
       </w:pPr>
       <w:r>
         <w:rPr>
@@ -847,14 +1087,14 @@
           <w:color w:val="53616B"/>
           <w:sz w:val="19"/>
         </w:rPr>
-        <w:t>2D 叙事解谜  |  独立开发、美术与声音整合  |  Unity / C#</w:t>
+        <w:t>2D 叙事解谜  |  独立开发 / 美术 / 程序 / 音效</w:t>
       </w:r>
     </w:p>
     <w:p>
       <w:pPr>
         <w:keepNext w:val="0"/>
         <w:widowControl/>
-        <w:spacing w:after="60" w:before="0"/>
+        <w:spacing w:after="60" w:before="0" w:line="284" w:lineRule="exact"/>
         <w:ind w:left="142" w:hanging="142"/>
       </w:pPr>
       <w:r>
@@ -873,14 +1113,14 @@
           <w:color w:val="19252E"/>
           <w:sz w:val="20"/>
         </w:rPr>
-        <w:t>完成探索、角色对话与机关解谜流程，将灯影切换、物品线索和剧情推进衔接成连续体验。</w:t>
+        <w:t>作品网站重点展示项目，使用 Codex 全程辅助完成，从美术素材组织、程序实现、音效素材查找、剧情体验到 WebGL 构建形成独立闭环。</w:t>
       </w:r>
     </w:p>
     <w:p>
       <w:pPr>
         <w:keepNext w:val="0"/>
         <w:widowControl/>
-        <w:spacing w:after="60" w:before="0"/>
+        <w:spacing w:after="60" w:before="0" w:line="284" w:lineRule="exact"/>
         <w:ind w:left="142" w:hanging="142"/>
       </w:pPr>
       <w:r>
@@ -899,14 +1139,57 @@
           <w:color w:val="19252E"/>
           <w:sz w:val="20"/>
         </w:rPr>
-        <w:t>接入角色语音与音效，整理地图、角色和界面资产，完成 WebGL 构建及线上作品展示。</w:t>
+        <w:t>接入人物语音克隆模型，实现角色对白表现；项目已接入线上作品网站，可通过网站查看视频展示与试玩入口。</w:t>
+      </w:r>
+    </w:p>
+    <w:p>
+      <w:pPr>
+        <w:keepNext/>
+        <w:tabs>
+          <w:tab w:pos="10035" w:val="right"/>
+        </w:tabs>
+        <w:spacing w:after="40" w:before="80" w:line="284" w:lineRule="exact"/>
+      </w:pPr>
+      <w:r>
+        <w:rPr>
+          <w:rFonts w:ascii="Arial" w:hAnsi="Arial" w:eastAsia="Microsoft YaHei"/>
+          <w:b/>
+          <w:color w:val="19252E"/>
+          <w:sz w:val="22"/>
+        </w:rPr>
+        <w:t>黑暗骑士</w:t>
+      </w:r>
+      <w:r>
+        <w:rPr>
+          <w:rFonts w:ascii="Arial" w:hAnsi="Arial" w:eastAsia="Microsoft YaHei"/>
+          <w:b w:val="0"/>
+          <w:color w:val="53616B"/>
+          <w:sz w:val="18"/>
+        </w:rPr>
+        <w:tab/>
+        <w:t>2026.04-2026.05</w:t>
+      </w:r>
+    </w:p>
+    <w:p>
+      <w:pPr>
+        <w:keepNext/>
+        <w:spacing w:after="40" w:before="0" w:line="284" w:lineRule="exact"/>
+      </w:pPr>
+      <w:r>
+        <w:rPr>
+          <w:rFonts w:ascii="Arial" w:hAnsi="Arial" w:eastAsia="Microsoft YaHei"/>
+          <w:b w:val="0"/>
+          <w:color w:val="53616B"/>
+          <w:sz w:val="19"/>
+        </w:rPr>
+        <w:t>2D 动作冒险  |  独立开发 / Codex 全流程</w:t>
       </w:r>
     </w:p>
     <w:p>
       <w:pPr>
         <w:keepNext w:val="0"/>
         <w:widowControl/>
-        <w:spacing w:after="60" w:before="0"/>
+        <w:spacing w:after="60" w:before="0" w:line="284" w:lineRule="exact"/>
         <w:ind w:left="142" w:hanging="142"/>
       </w:pPr>
       <w:r>
@@ -925,57 +1208,14 @@
           <w:color w:val="19252E"/>
           <w:sz w:val="20"/>
         </w:rPr>
-        <w:t>保留纸马铺、无声戏台与灯楼等分段实机演示，可用于展示关卡流程与叙事交互。</w:t>
-      </w:r>
-    </w:p>
-    <w:p>
-      <w:pPr>
-        <w:keepNext/>
-        <w:tabs>
-          <w:tab w:pos="10035" w:val="right"/>
-        </w:tabs>
-        <w:spacing w:after="40" w:before="120"/>
-      </w:pPr>
-      <w:r>
-        <w:rPr>
-          <w:rFonts w:ascii="Arial" w:hAnsi="Arial" w:eastAsia="Microsoft YaHei"/>
-          <w:b/>
-          <w:color w:val="19252E"/>
-          <w:sz w:val="22"/>
-        </w:rPr>
-        <w:t>黑暗骑士</w:t>
-      </w:r>
-      <w:r>
-        <w:rPr>
-          <w:rFonts w:ascii="Arial" w:hAnsi="Arial" w:eastAsia="Microsoft YaHei"/>
-          <w:b w:val="0"/>
-          <w:color w:val="53616B"/>
-          <w:sz w:val="18"/>
-        </w:rPr>
-        <w:tab/>
-        <w:t>已完成</w:t>
-      </w:r>
-    </w:p>
-    <w:p>
-      <w:pPr>
-        <w:keepNext/>
-        <w:spacing w:after="80" w:before="0"/>
-      </w:pPr>
-      <w:r>
-        <w:rPr>
-          <w:rFonts w:ascii="Arial" w:hAnsi="Arial" w:eastAsia="Microsoft YaHei"/>
-          <w:b w:val="0"/>
-          <w:color w:val="53616B"/>
-          <w:sz w:val="19"/>
-        </w:rPr>
-        <w:t>2D 动作冒险  |  独立开发与资产整合  |  Unity / C#</w:t>
+        <w:t>用 Codex 从视觉资产到玩法程序独立推进，强调完整闭环开发能力，并提供 Windows 本地试玩包展示。</w:t>
       </w:r>
     </w:p>
     <w:p>
       <w:pPr>
         <w:keepNext w:val="0"/>
         <w:widowControl/>
-        <w:spacing w:after="60" w:before="0"/>
+        <w:spacing w:after="60" w:before="0" w:line="284" w:lineRule="exact"/>
         <w:ind w:left="142" w:hanging="142"/>
       </w:pPr>
       <w:r>
@@ -994,14 +1234,57 @@
           <w:color w:val="19252E"/>
           <w:sz w:val="20"/>
         </w:rPr>
-        <w:t>实现近战连击、冲刺衔接与重击，组合攻击判定、状态切换、敌人行为及首领战流程。</w:t>
+        <w:t>完成基础动作、战斗反馈、关卡体验、音频整合和打包交付，沉淀 AI 辅助 2D 游戏开发流程。</w:t>
+      </w:r>
+    </w:p>
+    <w:p>
+      <w:pPr>
+        <w:keepNext/>
+        <w:tabs>
+          <w:tab w:pos="10035" w:val="right"/>
+        </w:tabs>
+        <w:spacing w:after="40" w:before="80" w:line="284" w:lineRule="exact"/>
+      </w:pPr>
+      <w:r>
+        <w:rPr>
+          <w:rFonts w:ascii="Arial" w:hAnsi="Arial" w:eastAsia="Microsoft YaHei"/>
+          <w:b/>
+          <w:color w:val="19252E"/>
+          <w:sz w:val="22"/>
+        </w:rPr>
+        <w:t>公司战争</w:t>
+      </w:r>
+      <w:r>
+        <w:rPr>
+          <w:rFonts w:ascii="Arial" w:hAnsi="Arial" w:eastAsia="Microsoft YaHei"/>
+          <w:b w:val="0"/>
+          <w:color w:val="53616B"/>
+          <w:sz w:val="18"/>
+        </w:rPr>
+        <w:tab/>
+        <w:t>2026.03-2026.04</w:t>
+      </w:r>
+    </w:p>
+    <w:p>
+      <w:pPr>
+        <w:keepNext/>
+        <w:spacing w:after="40" w:before="0" w:line="284" w:lineRule="exact"/>
+      </w:pPr>
+      <w:r>
+        <w:rPr>
+          <w:rFonts w:ascii="Arial" w:hAnsi="Arial" w:eastAsia="Microsoft YaHei"/>
+          <w:b w:val="0"/>
+          <w:color w:val="53616B"/>
+          <w:sz w:val="19"/>
+        </w:rPr>
+        <w:t>策略 / 竞赛项目  |  策划 + 程序协作</w:t>
       </w:r>
     </w:p>
     <w:p>
       <w:pPr>
         <w:keepNext w:val="0"/>
         <w:widowControl/>
-        <w:spacing w:after="60" w:before="0"/>
+        <w:spacing w:after="60" w:before="0" w:line="284" w:lineRule="exact"/>
         <w:ind w:left="142" w:hanging="142"/>
       </w:pPr>
       <w:r>
@@ -1020,57 +1303,14 @@
           <w:color w:val="19252E"/>
           <w:sz w:val="20"/>
         </w:rPr>
-        <w:t>整合命中停顿、屏幕震动和独立音效，打磨战斗反馈，完成 Windows 构建及战斗专项演示。</w:t>
-      </w:r>
-    </w:p>
-    <w:p>
-      <w:pPr>
-        <w:keepNext/>
-        <w:tabs>
-          <w:tab w:pos="10035" w:val="right"/>
-        </w:tabs>
-        <w:spacing w:after="40" w:before="120"/>
-      </w:pPr>
-      <w:r>
-        <w:rPr>
-          <w:rFonts w:ascii="Arial" w:hAnsi="Arial" w:eastAsia="Microsoft YaHei"/>
-          <w:b/>
-          <w:color w:val="19252E"/>
-          <w:sz w:val="22"/>
-        </w:rPr>
-        <w:t>公司战争</w:t>
-      </w:r>
-      <w:r>
-        <w:rPr>
-          <w:rFonts w:ascii="Arial" w:hAnsi="Arial" w:eastAsia="Microsoft YaHei"/>
-          <w:b w:val="0"/>
-          <w:color w:val="53616B"/>
-          <w:sz w:val="18"/>
-        </w:rPr>
-        <w:tab/>
-        <w:t>竞赛项目</w:t>
-      </w:r>
-    </w:p>
-    <w:p>
-      <w:pPr>
-        <w:keepNext/>
-        <w:spacing w:after="80" w:before="0"/>
-      </w:pPr>
-      <w:r>
-        <w:rPr>
-          <w:rFonts w:ascii="Arial" w:hAnsi="Arial" w:eastAsia="Microsoft YaHei"/>
-          <w:b w:val="0"/>
-          <w:color w:val="53616B"/>
-          <w:sz w:val="19"/>
-        </w:rPr>
-        <w:t>策略玩法  |  策划与程序协作  |  Unity / C#</w:t>
+        <w:t>与四川大学团队合作的竞赛项目，负责游戏策划、系统设计与程序协作，项目延展为后续多项高校赛事作品。</w:t>
       </w:r>
     </w:p>
     <w:p>
       <w:pPr>
         <w:keepNext w:val="0"/>
         <w:widowControl/>
-        <w:spacing w:after="60" w:before="0"/>
+        <w:spacing w:after="60" w:before="0" w:line="284" w:lineRule="exact"/>
         <w:ind w:left="142" w:hanging="142"/>
       </w:pPr>
       <w:r>
@@ -1089,14 +1329,57 @@
           <w:color w:val="19252E"/>
           <w:sz w:val="20"/>
         </w:rPr>
-        <w:t>与四川大学团队合作，参与核心玩法、单位与敌人数据结构、关卡配置及功能整合。</w:t>
+        <w:t>参与玩法规则、关卡配置、敌人和单位数据结构设计，项目已接入线上 WebGL 试玩。</w:t>
+      </w:r>
+    </w:p>
+    <w:p>
+      <w:pPr>
+        <w:keepNext/>
+        <w:tabs>
+          <w:tab w:pos="10035" w:val="right"/>
+        </w:tabs>
+        <w:spacing w:after="40" w:before="80" w:line="284" w:lineRule="exact"/>
+      </w:pPr>
+      <w:r>
+        <w:rPr>
+          <w:rFonts w:ascii="Arial" w:hAnsi="Arial" w:eastAsia="Microsoft YaHei"/>
+          <w:b/>
+          <w:color w:val="19252E"/>
+          <w:sz w:val="22"/>
+        </w:rPr>
+        <w:t>三星堆展馆</w:t>
+      </w:r>
+      <w:r>
+        <w:rPr>
+          <w:rFonts w:ascii="Arial" w:hAnsi="Arial" w:eastAsia="Microsoft YaHei"/>
+          <w:b w:val="0"/>
+          <w:color w:val="53616B"/>
+          <w:sz w:val="18"/>
+        </w:rPr>
+        <w:tab/>
+        <w:t>2025.03-2025.06</w:t>
+      </w:r>
+    </w:p>
+    <w:p>
+      <w:pPr>
+        <w:keepNext/>
+        <w:spacing w:after="40" w:before="0" w:line="284" w:lineRule="exact"/>
+      </w:pPr>
+      <w:r>
+        <w:rPr>
+          <w:rFonts w:ascii="Arial" w:hAnsi="Arial" w:eastAsia="Microsoft YaHei"/>
+          <w:b w:val="0"/>
+          <w:color w:val="53616B"/>
+          <w:sz w:val="19"/>
+        </w:rPr>
+        <w:t>3D 展馆 / 教育交互  |  Unity 开发</w:t>
       </w:r>
     </w:p>
     <w:p>
       <w:pPr>
         <w:keepNext w:val="0"/>
         <w:widowControl/>
-        <w:spacing w:after="60" w:before="0"/>
+        <w:spacing w:after="60" w:before="0" w:line="284" w:lineRule="exact"/>
         <w:ind w:left="142" w:hanging="142"/>
       </w:pPr>
       <w:r>
@@ -1115,30 +1398,57 @@
           <w:color w:val="19252E"/>
           <w:sz w:val="20"/>
         </w:rPr>
-        <w:t>完成 WebGL 演示构建，积累短周期需求拆解、协同开发及版本交付经验。</w:t>
+        <w:t>负责文化展馆类 3D 交互项目的程序实现与策划组织，完成展馆漫游、展陈空间交互与 WebGL 构建。</w:t>
       </w:r>
     </w:p>
     <w:p>
       <w:pPr>
-        <w:pStyle w:val="Heading1"/>
         <w:keepNext/>
-        <w:spacing w:after="100" w:before="160"/>
+        <w:tabs>
+          <w:tab w:pos="10035" w:val="right"/>
+        </w:tabs>
+        <w:spacing w:after="40" w:before="80" w:line="284" w:lineRule="exact"/>
       </w:pPr>
       <w:r>
         <w:rPr>
           <w:rFonts w:ascii="Arial" w:hAnsi="Arial" w:eastAsia="Microsoft YaHei"/>
           <w:b/>
-          <w:color w:val="24586B"/>
-          <w:sz w:val="24"/>
+          <w:color w:val="19252E"/>
+          <w:sz w:val="22"/>
         </w:rPr>
-        <w:t>其他交互与玩法实践</w:t>
+        <w:t>VR / MR 博物馆</w:t>
+      </w:r>
+      <w:r>
+        <w:rPr>
+          <w:rFonts w:ascii="Arial" w:hAnsi="Arial" w:eastAsia="Microsoft YaHei"/>
+          <w:b w:val="0"/>
+          <w:color w:val="53616B"/>
+          <w:sz w:val="18"/>
+        </w:rPr>
+        <w:tab/>
+        <w:t>2025.10-2025.11</w:t>
+      </w:r>
+    </w:p>
+    <w:p>
+      <w:pPr>
+        <w:keepNext/>
+        <w:spacing w:after="40" w:before="0" w:line="284" w:lineRule="exact"/>
+      </w:pPr>
+      <w:r>
+        <w:rPr>
+          <w:rFonts w:ascii="Arial" w:hAnsi="Arial" w:eastAsia="Microsoft YaHei"/>
+          <w:b w:val="0"/>
+          <w:color w:val="53616B"/>
+          <w:sz w:val="19"/>
+        </w:rPr>
+        <w:t>沉浸式展陈 / 混合现实  |  Unity / MRTK / HoloLens 2</w:t>
       </w:r>
     </w:p>
     <w:p>
       <w:pPr>
         <w:keepNext w:val="0"/>
         <w:widowControl/>
-        <w:spacing w:after="60" w:before="0"/>
+        <w:spacing w:after="60" w:before="0" w:line="284" w:lineRule="exact"/>
         <w:ind w:left="142" w:hanging="142"/>
       </w:pPr>
       <w:r>
@@ -1157,14 +1467,56 @@
           <w:color w:val="19252E"/>
           <w:sz w:val="20"/>
         </w:rPr>
-        <w:t>水上乐园：实现 NPC 排队、商品拾取与交付、库存、现金及阶段解锁，形成经营循环。</w:t>
+        <w:t>在 VR 博物馆方向实践沉浸式浏览、展品查看、空间交互、MRTK/Oculus 相关流程和跨平台适配。</w:t>
+      </w:r>
+    </w:p>
+    <w:p>
+      <w:pPr>
+        <w:keepNext/>
+        <w:tabs>
+          <w:tab w:pos="10035" w:val="right"/>
+        </w:tabs>
+        <w:spacing w:after="40" w:before="80" w:line="284" w:lineRule="exact"/>
+      </w:pPr>
+      <w:r>
+        <w:rPr>
+          <w:rFonts w:ascii="Arial" w:hAnsi="Arial" w:eastAsia="Microsoft YaHei"/>
+          <w:b/>
+          <w:color w:val="19252E"/>
+          <w:sz w:val="22"/>
+        </w:rPr>
+        <w:t>水上乐园 / 数据漫游 / 飞机大战 / 恐怖游戏</w:t>
+      </w:r>
+      <w:r>
+        <w:rPr>
+          <w:rFonts w:ascii="Arial" w:hAnsi="Arial" w:eastAsia="Microsoft YaHei"/>
+          <w:b w:val="0"/>
+          <w:color w:val="53616B"/>
+          <w:sz w:val="18"/>
+        </w:rPr>
+        <w:tab/>
+      </w:r>
+    </w:p>
+    <w:p>
+      <w:pPr>
+        <w:keepNext/>
+        <w:spacing w:after="40" w:before="0" w:line="284" w:lineRule="exact"/>
+      </w:pPr>
+      <w:r>
+        <w:rPr>
+          <w:rFonts w:ascii="Arial" w:hAnsi="Arial" w:eastAsia="Microsoft YaHei"/>
+          <w:b w:val="0"/>
+          <w:color w:val="53616B"/>
+          <w:sz w:val="19"/>
+        </w:rPr>
+        <w:t>Unity 3D / WebGL / 小游戏合集</w:t>
       </w:r>
     </w:p>
     <w:p>
       <w:pPr>
         <w:keepNext w:val="0"/>
         <w:widowControl/>
-        <w:spacing w:after="60" w:before="0"/>
+        <w:spacing w:after="60" w:before="0" w:line="284" w:lineRule="exact"/>
         <w:ind w:left="142" w:hanging="142"/>
       </w:pPr>
       <w:r>
@@ -1183,14 +1535,69 @@
           <w:color w:val="19252E"/>
           <w:sz w:val="20"/>
         </w:rPr>
-        <w:t>三星堆展馆、VR 博物馆：参与 3D 展馆漫游、展品查看和空间交互；另有数据漫游与射击小游戏实践。</w:t>
+        <w:t>水上乐园（2025.11-2025.12）：实现阶段解锁、NPC 排队交易、物品拾取/存放/投递、库存与前台 UI，并完成 WebGL/GitHub Pages 试玩部署。</w:t>
+      </w:r>
+    </w:p>
+    <w:p>
+      <w:pPr>
+        <w:keepNext w:val="0"/>
+        <w:widowControl/>
+        <w:spacing w:after="60" w:before="0" w:line="284" w:lineRule="exact"/>
+        <w:ind w:left="142" w:hanging="142"/>
+      </w:pPr>
+      <w:r>
+        <w:rPr>
+          <w:rFonts w:ascii="Arial" w:hAnsi="Arial" w:eastAsia="Microsoft YaHei"/>
+          <w:b/>
+          <w:color w:val="24586B"/>
+          <w:sz w:val="20"/>
+        </w:rPr>
+        <w:t xml:space="preserve">• </w:t>
+      </w:r>
+      <w:r>
+        <w:rPr>
+          <w:rFonts w:ascii="Arial" w:hAnsi="Arial" w:eastAsia="Microsoft YaHei"/>
+          <w:b w:val="0"/>
+          <w:color w:val="19252E"/>
+          <w:sz w:val="20"/>
+        </w:rPr>
+        <w:t>数据漫游等寒假委托项目（2026.01-2026.02）：覆盖数据空间展示、3D 与卡通场景漫游，完成课程小游戏与展示类项目交付。</w:t>
+      </w:r>
+    </w:p>
+    <w:p>
+      <w:pPr>
+        <w:keepNext w:val="0"/>
+        <w:widowControl/>
+        <w:spacing w:after="60" w:before="0" w:line="284" w:lineRule="exact"/>
+        <w:ind w:left="142" w:hanging="142"/>
+      </w:pPr>
+      <w:r>
+        <w:rPr>
+          <w:rFonts w:ascii="Arial" w:hAnsi="Arial" w:eastAsia="Microsoft YaHei"/>
+          <w:b/>
+          <w:color w:val="24586B"/>
+          <w:sz w:val="20"/>
+        </w:rPr>
+        <w:t xml:space="preserve">• </w:t>
+      </w:r>
+      <w:r>
+        <w:rPr>
+          <w:rFonts w:ascii="Arial" w:hAnsi="Arial" w:eastAsia="Microsoft YaHei"/>
+          <w:b w:val="0"/>
+          <w:color w:val="19252E"/>
+          <w:sz w:val="20"/>
+        </w:rPr>
+        <w:t>恐怖游戏（2025.02-2025.04）：实现武器交互、怪物追踪巡逻、门体交互及脚步声与突发音效；另有飞机大战等射击原型。</w:t>
       </w:r>
     </w:p>
     <w:p>
       <w:pPr>
         <w:pStyle w:val="Heading1"/>
         <w:keepNext/>
-        <w:spacing w:after="100" w:before="160"/>
+        <w:spacing w:after="100" w:before="160" w:line="300" w:lineRule="exact"/>
+        <w:pBdr>
+          <w:bottom w:val="single" w:sz="4" w:space="3" w:color="ABB6BA"/>
+        </w:pBdr>
       </w:pPr>
       <w:r>
         <w:rPr>
@@ -1206,7 +1613,7 @@
       <w:pPr>
         <w:keepNext w:val="0"/>
         <w:widowControl/>
-        <w:spacing w:after="60" w:before="0"/>
+        <w:spacing w:after="60" w:before="0" w:line="284" w:lineRule="exact"/>
         <w:ind w:left="142" w:hanging="142"/>
       </w:pPr>
       <w:r>
@@ -1232,7 +1639,7 @@
       <w:pPr>
         <w:keepNext w:val="0"/>
         <w:widowControl/>
-        <w:spacing w:after="60" w:before="0"/>
+        <w:spacing w:after="60" w:before="0" w:line="284" w:lineRule="exact"/>
         <w:ind w:left="142" w:hanging="142"/>
       </w:pPr>
       <w:r>
@@ -1258,7 +1665,10 @@
       <w:pPr>
         <w:pStyle w:val="Heading1"/>
         <w:keepNext/>
-        <w:spacing w:after="100" w:before="160"/>
+        <w:spacing w:after="100" w:before="160" w:line="300" w:lineRule="exact"/>
+        <w:pBdr>
+          <w:bottom w:val="single" w:sz="4" w:space="3" w:color="ABB6BA"/>
+        </w:pBdr>
       </w:pPr>
       <w:r>
         <w:rPr>
@@ -1267,25 +1677,63 @@
           <w:color w:val="24586B"/>
           <w:sz w:val="24"/>
         </w:rPr>
-        <w:t>开发方法与作品表达</w:t>
+        <w:t>专业技能</w:t>
       </w:r>
     </w:p>
     <w:p>
       <w:pPr>
         <w:keepNext w:val="0"/>
-        <w:widowControl/>
-        <w:spacing w:after="60" w:before="0"/>
-        <w:ind w:left="142" w:hanging="142"/>
+        <w:spacing w:after="60" w:before="0" w:line="284" w:lineRule="exact"/>
+      </w:pPr>
+      <w:r>
+        <w:rPr>
+          <w:rFonts w:ascii="Arial" w:hAnsi="Arial" w:eastAsia="Microsoft YaHei"/>
+          <w:b w:val="0"/>
+          <w:color w:val="19252E"/>
+          <w:sz w:val="19"/>
+        </w:rPr>
+        <w:t>开发：Unity 6 / C#、Three.js / JavaScript / WebGL、Git；Blender 与 UE5 场景制作实践。</w:t>
+      </w:r>
+    </w:p>
+    <w:p>
+      <w:pPr>
+        <w:keepNext w:val="0"/>
+        <w:spacing w:after="60" w:before="0" w:line="284" w:lineRule="exact"/>
+      </w:pPr>
+      <w:r>
+        <w:rPr>
+          <w:rFonts w:ascii="Arial" w:hAnsi="Arial" w:eastAsia="Microsoft YaHei"/>
+          <w:b w:val="0"/>
+          <w:color w:val="19252E"/>
+          <w:sz w:val="19"/>
+        </w:rPr>
+        <w:t>实践：3D / VR 交互、实机录屏、开发日志与展示视频；AI 工具：Codex、Claude Code、Trae。</w:t>
+      </w:r>
+    </w:p>
+    <w:p>
+      <w:pPr>
+        <w:pStyle w:val="Heading1"/>
+        <w:keepNext/>
+        <w:spacing w:after="100" w:before="160" w:line="300" w:lineRule="exact"/>
+        <w:pBdr>
+          <w:bottom w:val="single" w:sz="4" w:space="3" w:color="ABB6BA"/>
+        </w:pBdr>
       </w:pPr>
       <w:r>
         <w:rPr>
           <w:rFonts w:ascii="Arial" w:hAnsi="Arial" w:eastAsia="Microsoft YaHei"/>
           <w:b/>
           <w:color w:val="24586B"/>
-          <w:sz w:val="20"/>
+          <w:sz w:val="24"/>
         </w:rPr>
-        <w:t xml:space="preserve">• </w:t>
+        <w:t>兴趣爱好</w:t>
       </w:r>
+    </w:p>
+    <w:p>
+      <w:pPr>
+        <w:keepNext w:val="0"/>
+        <w:spacing w:after="60" w:before="0" w:line="284" w:lineRule="exact"/>
+      </w:pPr>
       <w:r>
         <w:rPr>
           <w:rFonts w:ascii="Arial" w:hAnsi="Arial" w:eastAsia="Microsoft YaHei"/>
@@ -1293,33 +1741,7 @@
           <w:color w:val="19252E"/>
           <w:sz w:val="20"/>
         </w:rPr>
-        <w:t>将需求拆成玩法规则、系统状态和验收条件，使用 Codex、Claude Code、Trae 辅助实现与调试，持续回到运行画面核对结果。</w:t>
-      </w:r>
-    </w:p>
-    <w:p>
-      <w:pPr>
-        <w:keepNext w:val="0"/>
-        <w:widowControl/>
-        <w:spacing w:after="60" w:before="0"/>
-        <w:ind w:left="142" w:hanging="142"/>
-      </w:pPr>
-      <w:r>
-        <w:rPr>
-          <w:rFonts w:ascii="Arial" w:hAnsi="Arial" w:eastAsia="Microsoft YaHei"/>
-          <w:b/>
-          <w:color w:val="24586B"/>
-          <w:sz w:val="20"/>
-        </w:rPr>
-        <w:t xml:space="preserve">• </w:t>
-      </w:r>
-      <w:r>
-        <w:rPr>
-          <w:rFonts w:ascii="Arial" w:hAnsi="Arial" w:eastAsia="Microsoft YaHei"/>
-          <w:b w:val="0"/>
-          <w:color w:val="19252E"/>
-          <w:sz w:val="20"/>
-        </w:rPr>
-        <w:t>能够整理实机录屏、撰写开发日志、制作配音字幕及展示成片，向团队与客户说明玩法、完成范围和迭代成果。</w:t>
+        <w:t>健身。</w:t>
       </w:r>
     </w:p>
     <w:sectPr>
@@ -1718,7 +2140,8 @@
     <w:qFormat/>
     <w:rsid w:val="00FC693F"/>
     <w:pPr>
-      <w:spacing w:line="271" w:lineRule="auto" w:after="60"/>
+      <w:spacing w:line="284" w:lineRule="exact" w:after="60"/>
+      <w:snapToGrid w:val="0"/>
     </w:pPr>
     <w:rPr>
       <w:rFonts w:ascii="Arial" w:hAnsi="Arial" w:eastAsia="Microsoft YaHei"/>

</xml_diff>

<commit_message>
Publish new portfolio URL and final resume with resilient WebGL loading
</commit_message>
<xml_diff>
--- a/public/portfolio/li-benyan-resume.docx
+++ b/public/portfolio/li-benyan-resume.docx
@@ -51,7 +51,7 @@
                 <w:color w:val="24586B"/>
                 <w:sz w:val="23"/>
               </w:rPr>
-              <w:t>游戏开发  /  AI 产品开发</w:t>
+              <w:t>求职意向：前端开发实习生（Unity 客户端方向）</w:t>
             </w:r>
           </w:p>
           <w:p>
@@ -88,7 +88,7 @@
                   <w:sz w:val="18"/>
                   <w:rFonts w:ascii="Arial" w:eastAsia="Microsoft YaHei"/>
                 </w:rPr>
-                <w:t>b2f1101b.game-portfolio.pages.dev</w:t>
+                <w:t>muyan-game-portfolio.pages.dev</w:t>
               </w:r>
             </w:hyperlink>
           </w:p>
@@ -555,7 +555,7 @@
           <w:color w:val="53616B"/>
           <w:sz w:val="19"/>
         </w:rPr>
-        <w:t>商业定制 · 移动端  |  策划、程序及美术音效统筹  |  Unity / C#</w:t>
+        <w:t>商业定制 · 移动端 / Windows  |  策划、程序及美术音效统筹  |  Unity / C#</w:t>
       </w:r>
     </w:p>
     <w:p>
@@ -633,7 +633,7 @@
           <w:color w:val="19252E"/>
           <w:sz w:val="20"/>
         </w:rPr>
-        <w:t>完成 Android 安装包构建；iOS 完成签名归档、上传 App Store Connect 并进入 TestFlight 内测。</w:t>
+        <w:t>完成 Android / Windows 0.1.27 试玩包构建；iOS 完成签名归档并进入 TestFlight 内测。</w:t>
       </w:r>
     </w:p>
     <w:p>

</xml_diff>